<commit_message>
feat(templates): commission field map, docxtpl context helper, minimal report docx
Co-authored-by: Cursor <cursoragent@cursor.com>
</commit_message>
<xml_diff>
--- a/templates/report/jinja_minimal.docx
+++ b/templates/report/jinja_minimal.docx
@@ -7,7 +7,7 @@
         <w:pStyle w:val="Title"/>
       </w:pPr>
       <w:r>
-        <w:t>排水管道电视检测报告</w:t>
+        <w:t>CCTV 检测报告（自动生成）</w:t>
       </w:r>
     </w:p>
     <w:p>
@@ -22,22 +22,32 @@
     </w:p>
     <w:p>
       <w:r>
-        <w:t>项目编号：{{ project_code }}</w:t>
+        <w:t>工程编号：{{ project_code }}</w:t>
       </w:r>
     </w:p>
     <w:p>
       <w:r>
-        <w:t>检测路段：{{ road_name }}</w:t>
+        <w:t>道路/工区：{{ road_name }}</w:t>
       </w:r>
     </w:p>
     <w:p>
       <w:r>
-        <w:t>编制日期：{{ report_date }}</w:t>
+        <w:t>联系人：{{ contact_name }}　电话：{{ contact_phone }}</w:t>
       </w:r>
     </w:p>
     <w:p>
       <w:r>
-        <w:t>一、管段与缺陷摘要</w:t>
+        <w:t>检测范围概述：{{ scope_text }}</w:t>
+      </w:r>
+    </w:p>
+    <w:p>
+      <w:r>
+        <w:t>报告日期：{{ report_date }}</w:t>
+      </w:r>
+    </w:p>
+    <w:p>
+      <w:r>
+        <w:t>--- 正文 ---</w:t>
       </w:r>
     </w:p>
     <w:p>

</xml_diff>